<commit_message>
feature: add resume photo upload and new fields for projects and companies.
</commit_message>
<xml_diff>
--- a/src/infra/resume_export/templates/accent/resume.docx
+++ b/src/infra/resume_export/templates/accent/resume.docx
@@ -8,6 +8,24 @@
       </w:pPr>
       <w:r>
         <w:t>{{ display_name }}</w:t>
+      </w:r>
+    </w:p>
+    <w:p>
+      <w:pPr/>
+      <w:r>
+        <w:t>{%p if photo %}</w:t>
+      </w:r>
+    </w:p>
+    <w:p>
+      <w:pPr/>
+      <w:r>
+        <w:t>{{ photo }}</w:t>
+      </w:r>
+    </w:p>
+    <w:p>
+      <w:pPr/>
+      <w:r>
+        <w:t>{%p endif %}</w:t>
       </w:r>
     </w:p>
     <w:p>
@@ -415,6 +433,26 @@
       </w:r>
     </w:p>
     <w:p>
+      <w:pPr/>
+      <w:r>
+        <w:t>{%p if experience.item.company_website_url %}</w:t>
+      </w:r>
+    </w:p>
+    <w:p>
+      <w:pPr>
+        <w:spacing w:before="0" w:after="0"/>
+      </w:pPr>
+      <w:r>
+        <w:t>{{ experience.item.company_website_url }}</w:t>
+      </w:r>
+    </w:p>
+    <w:p>
+      <w:pPr/>
+      <w:r>
+        <w:t>{%p endif %}</w:t>
+      </w:r>
+    </w:p>
+    <w:p>
       <w:pPr>
         <w:pStyle w:val="ResumeMuted"/>
       </w:pPr>
@@ -494,6 +532,46 @@
       </w:pPr>
       <w:r>
         <w:t>{{ labels.project }}: {{ project.name }}{% if project.role and project.role != experience.item.position %} | {{ project.role }}{% endif %}</w:t>
+      </w:r>
+    </w:p>
+    <w:p>
+      <w:pPr/>
+      <w:r>
+        <w:t>{%p if project.team_size %}</w:t>
+      </w:r>
+    </w:p>
+    <w:p>
+      <w:pPr>
+        <w:spacing w:before="0" w:after="0"/>
+      </w:pPr>
+      <w:r>
+        <w:t>{{ labels.team_size }}: {{ project.team_size }}</w:t>
+      </w:r>
+    </w:p>
+    <w:p>
+      <w:pPr/>
+      <w:r>
+        <w:t>{%p endif %}</w:t>
+      </w:r>
+    </w:p>
+    <w:p>
+      <w:pPr/>
+      <w:r>
+        <w:t>{%p if project.scale %}</w:t>
+      </w:r>
+    </w:p>
+    <w:p>
+      <w:pPr>
+        <w:spacing w:before="0" w:after="0"/>
+      </w:pPr>
+      <w:r>
+        <w:t>{{ labels.scale }}: {{ project.scale }}</w:t>
+      </w:r>
+    </w:p>
+    <w:p>
+      <w:pPr/>
+      <w:r>
+        <w:t>{%p endif %}</w:t>
       </w:r>
     </w:p>
     <w:p>

</xml_diff>

<commit_message>
feat(resumes): persist document section order and visibility
Validate section preferences in the API and domain, migrate existing resumes without losing their content, and apply the preferences consistently to PDF and DOCX exports.
</commit_message>
<xml_diff>
--- a/src/infra/resume_export/templates/accent/resume.docx
+++ b/src/infra/resume_export/templates/accent/resume.docx
@@ -159,6 +159,18 @@
     <w:p>
       <w:pPr/>
       <w:r>
+        <w:t>{%p for section_key in sections %}</w:t>
+      </w:r>
+    </w:p>
+    <w:p>
+      <w:pPr/>
+      <w:r>
+        <w:t>{%p if section_key == 'summary' %}</w:t>
+      </w:r>
+    </w:p>
+    <w:p>
+      <w:pPr/>
+      <w:r>
         <w:t>{%p if content.summary.text %}</w:t>
       </w:r>
     </w:p>
@@ -182,6 +194,18 @@
       <w:pPr/>
       <w:r>
         <w:t>{%p endif %}</w:t>
+      </w:r>
+    </w:p>
+    <w:p>
+      <w:pPr/>
+      <w:r>
+        <w:t>{%p endif %}</w:t>
+      </w:r>
+    </w:p>
+    <w:p>
+      <w:pPr/>
+      <w:r>
+        <w:t>{%p if section_key == 'skills' %}</w:t>
       </w:r>
     </w:p>
     <w:p>
@@ -222,6 +246,18 @@
       <w:pPr/>
       <w:r>
         <w:t>{%p endif %}</w:t>
+      </w:r>
+    </w:p>
+    <w:p>
+      <w:pPr/>
+      <w:r>
+        <w:t>{%p endif %}</w:t>
+      </w:r>
+    </w:p>
+    <w:p>
+      <w:pPr/>
+      <w:r>
+        <w:t>{%p if section_key == 'education' %}</w:t>
       </w:r>
     </w:p>
     <w:p>
@@ -301,7 +337,7 @@
     <w:p>
       <w:pPr/>
       <w:r>
-        <w:t>{%p for section in content.additional_sections if section.title == labels.education %}</w:t>
+        <w:t>{%p for section in education_sections %}</w:t>
       </w:r>
     </w:p>
     <w:p>
@@ -387,6 +423,18 @@
     <w:p>
       <w:pPr/>
       <w:r>
+        <w:t>{%p endif %}</w:t>
+      </w:r>
+    </w:p>
+    <w:p>
+      <w:pPr/>
+      <w:r>
+        <w:t>{%p if section_key == 'languages' %}</w:t>
+      </w:r>
+    </w:p>
+    <w:p>
+      <w:pPr/>
+      <w:r>
         <w:t>{%p if content.languages %}</w:t>
       </w:r>
     </w:p>
@@ -402,6 +450,18 @@
       <w:pPr/>
       <w:r>
         <w:t>{%p endif %}</w:t>
+      </w:r>
+    </w:p>
+    <w:p>
+      <w:pPr/>
+      <w:r>
+        <w:t>{%p endif %}</w:t>
+      </w:r>
+    </w:p>
+    <w:p>
+      <w:pPr/>
+      <w:r>
+        <w:t>{%p if section_key == 'experience' %}</w:t>
       </w:r>
     </w:p>
     <w:p>
@@ -675,6 +735,18 @@
     <w:p>
       <w:pPr/>
       <w:r>
+        <w:t>{%p endif %}</w:t>
+      </w:r>
+    </w:p>
+    <w:p>
+      <w:pPr/>
+      <w:r>
+        <w:t>{%p if section_key == 'certifications' %}</w:t>
+      </w:r>
+    </w:p>
+    <w:p>
+      <w:pPr/>
+      <w:r>
         <w:t>{%p if certifications %}</w:t>
       </w:r>
     </w:p>
@@ -755,7 +827,19 @@
     <w:p>
       <w:pPr/>
       <w:r>
-        <w:t>{%p for section in content.additional_sections if section.title != labels.education or educations %}</w:t>
+        <w:t>{%p endif %}</w:t>
+      </w:r>
+    </w:p>
+    <w:p>
+      <w:pPr/>
+      <w:r>
+        <w:t>{%p if section_key == 'additionalSections' %}</w:t>
+      </w:r>
+    </w:p>
+    <w:p>
+      <w:pPr/>
+      <w:r>
+        <w:t>{%p for section in additional_sections %}</w:t>
       </w:r>
     </w:p>
     <w:p>
@@ -824,6 +908,18 @@
       <w:pPr/>
       <w:r>
         <w:t>{%p endfor %}</w:t>
+      </w:r>
+    </w:p>
+    <w:p>
+      <w:pPr/>
+      <w:r>
+        <w:t>{%p endfor %}</w:t>
+      </w:r>
+    </w:p>
+    <w:p>
+      <w:pPr/>
+      <w:r>
+        <w:t>{%p endif %}</w:t>
       </w:r>
     </w:p>
     <w:p>

</xml_diff>